<commit_message>
Test movimiento + turnos que tardan ambos jugadores en pisar todas las casillas del tablero
</commit_message>
<xml_diff>
--- a/PL1/Explicacion funcions (defensa).docx
+++ b/PL1/Explicacion funcions (defensa).docx
@@ -390,10 +390,7 @@
         <w:t>) de la partida y nos devolverá un número</w:t>
       </w:r>
       <w:r>
-        <w:t xml:space="preserve"> </w:t>
-      </w:r>
-      <w:r>
-        <w:t>(</w:t>
+        <w:t xml:space="preserve"> (</w:t>
       </w:r>
       <w:r>
         <w:rPr>
@@ -487,16 +484,7 @@
           <w:sz w:val="28"/>
           <w:szCs w:val="28"/>
         </w:rPr>
-        <w:t>Move</w:t>
-      </w:r>
-      <w:r>
-        <w:rPr>
-          <w:b/>
-          <w:bCs/>
-          <w:sz w:val="28"/>
-          <w:szCs w:val="28"/>
-        </w:rPr>
-        <w:t>r</w:t>
+        <w:t>Mover</w:t>
       </w:r>
       <w:r>
         <w:rPr>
@@ -561,14 +549,7 @@
           <w:b/>
           <w:bCs/>
         </w:rPr>
-        <w:t>, Dinero, Props)</w:t>
-      </w:r>
-      <w:r>
-        <w:rPr>
-          <w:b/>
-          <w:bCs/>
-        </w:rPr>
-        <w:t>)</w:t>
+        <w:t>, Dinero, Props))</w:t>
       </w:r>
       <w:r>
         <w:t xml:space="preserve"> y el número que hemos sacado en la tirada</w:t>
@@ -641,14 +622,7 @@
           <w:b/>
           <w:bCs/>
         </w:rPr>
-        <w:t>, Props)</w:t>
-      </w:r>
-      <w:r>
-        <w:rPr>
-          <w:b/>
-          <w:bCs/>
-        </w:rPr>
-        <w:t>)</w:t>
+        <w:t>, Props))</w:t>
       </w:r>
       <w:r>
         <w:t xml:space="preserve"> en la posición nueva </w:t>
@@ -833,212 +807,388 @@
           <w:sz w:val="28"/>
           <w:szCs w:val="28"/>
         </w:rPr>
-        <w:t>Ejecuta</w:t>
-      </w:r>
-      <w:r>
-        <w:rPr>
-          <w:b/>
-          <w:bCs/>
-          <w:sz w:val="28"/>
-          <w:szCs w:val="28"/>
-        </w:rPr>
+        <w:t>Ejecutar</w:t>
+      </w:r>
+      <w:r>
+        <w:rPr>
+          <w:b/>
+          <w:bCs/>
+          <w:sz w:val="28"/>
+          <w:szCs w:val="28"/>
+        </w:rPr>
+        <w:t xml:space="preserve"> </w:t>
+      </w:r>
+      <w:r>
+        <w:rPr>
+          <w:b/>
+          <w:bCs/>
+          <w:sz w:val="28"/>
+          <w:szCs w:val="28"/>
+        </w:rPr>
+        <w:t>movimiento</w:t>
+      </w:r>
+    </w:p>
+    <w:p>
+      <w:r>
+        <w:t xml:space="preserve">Simplemente agrupa </w:t>
+      </w:r>
+      <w:r>
+        <w:rPr>
+          <w:b/>
+          <w:bCs/>
+          <w:color w:val="4472C4" w:themeColor="accent1"/>
+        </w:rPr>
+        <w:t>Tirar Dado</w:t>
+      </w:r>
+      <w:r>
+        <w:rPr>
+          <w:color w:val="4472C4" w:themeColor="accent1"/>
+        </w:rPr>
+        <w:t xml:space="preserve"> </w:t>
+      </w:r>
+      <w:r>
+        <w:t xml:space="preserve">y </w:t>
+      </w:r>
+      <w:r>
+        <w:rPr>
+          <w:b/>
+          <w:bCs/>
+          <w:color w:val="4472C4" w:themeColor="accent1"/>
+        </w:rPr>
+        <w:t>Mover Jugador</w:t>
+      </w:r>
+      <w:r>
+        <w:rPr>
+          <w:color w:val="4472C4" w:themeColor="accent1"/>
+        </w:rPr>
+        <w:t xml:space="preserve"> </w:t>
+      </w:r>
+      <w:r>
+        <w:rPr>
+          <w:b/>
+          <w:bCs/>
+        </w:rPr>
+        <w:t>en una sola acción</w:t>
+      </w:r>
+      <w:r>
+        <w:t>, ya que en realidad van de la mano (cuando tiras un dado después te mueves). Esto lo hacemos para una mayor limpieza del código y evitar así llamar a dos funciones cada vez que las necesitemos a lo largo de todo el programa.</w:t>
+      </w:r>
+    </w:p>
+    <w:p>
+      <w:r>
+        <w:t xml:space="preserve">Le pasamos el </w:t>
+      </w:r>
+      <w:r>
+        <w:rPr>
+          <w:b/>
+          <w:bCs/>
+        </w:rPr>
+        <w:t>jugador actual</w:t>
+      </w:r>
+      <w:r>
+        <w:t xml:space="preserve"> (</w:t>
+      </w:r>
+      <w:proofErr w:type="gramStart"/>
+      <w:r>
+        <w:rPr>
+          <w:b/>
+          <w:bCs/>
+        </w:rPr>
+        <w:t>jugador(</w:t>
+      </w:r>
+      <w:proofErr w:type="gramEnd"/>
+      <w:r>
+        <w:rPr>
+          <w:b/>
+          <w:bCs/>
+        </w:rPr>
+        <w:t xml:space="preserve">(Nombre, </w:t>
+      </w:r>
+      <w:proofErr w:type="spellStart"/>
+      <w:r>
+        <w:rPr>
+          <w:b/>
+          <w:bCs/>
+        </w:rPr>
+        <w:t>Pos</w:t>
+      </w:r>
+      <w:proofErr w:type="spellEnd"/>
+      <w:r>
+        <w:rPr>
+          <w:b/>
+          <w:bCs/>
+        </w:rPr>
+        <w:t>, Dinero, Props</w:t>
+      </w:r>
+      <w:proofErr w:type="gramStart"/>
+      <w:r>
+        <w:rPr>
+          <w:b/>
+          <w:bCs/>
+        </w:rPr>
+        <w:t>))</w:t>
+      </w:r>
+      <w:r>
+        <w:rPr>
+          <w:b/>
+          <w:bCs/>
+        </w:rPr>
+        <w:t xml:space="preserve"> </w:t>
+      </w:r>
+      <w:r>
+        <w:t xml:space="preserve"> y</w:t>
+      </w:r>
+      <w:proofErr w:type="gramEnd"/>
+      <w:r>
+        <w:t xml:space="preserve"> el </w:t>
+      </w:r>
+      <w:r>
+        <w:rPr>
+          <w:b/>
+          <w:bCs/>
+        </w:rPr>
+        <w:t>Numero de turno</w:t>
+      </w:r>
+      <w:r>
+        <w:t xml:space="preserve"> global. Llama a tirar dado y lo guarda en la variable </w:t>
+      </w:r>
+      <w:proofErr w:type="spellStart"/>
+      <w:r>
+        <w:rPr>
+          <w:b/>
+          <w:bCs/>
+        </w:rPr>
+        <w:t>DadoSacado</w:t>
+      </w:r>
+      <w:proofErr w:type="spellEnd"/>
+      <w:r>
+        <w:t xml:space="preserve">. Luego llama a </w:t>
+      </w:r>
+      <w:r>
+        <w:rPr>
+          <w:b/>
+          <w:bCs/>
+        </w:rPr>
+        <w:t>Mover Jugador</w:t>
+      </w:r>
+      <w:r>
+        <w:t xml:space="preserve"> y devuelve al jugador con su nueva posición y si hace falta su nuevo dinero </w:t>
+      </w:r>
+    </w:p>
+    <w:p>
+      <w:r>
+        <w:t xml:space="preserve">La función devuelve el jugador y el dado que ha sacado (que esto </w:t>
+      </w:r>
+      <w:proofErr w:type="spellStart"/>
+      <w:r>
+        <w:t>ultimo</w:t>
+      </w:r>
+      <w:proofErr w:type="spellEnd"/>
+      <w:r>
+        <w:t xml:space="preserve"> nos es útil para luego imprimir el numero que ha sacado el dado en </w:t>
+      </w:r>
+      <w:proofErr w:type="spellStart"/>
+      <w:r>
+        <w:rPr>
+          <w:b/>
+          <w:bCs/>
+          <w:color w:val="4472C4" w:themeColor="accent1"/>
+        </w:rPr>
+        <w:t>turno_limpio</w:t>
+      </w:r>
+      <w:proofErr w:type="spellEnd"/>
+      <w:r>
+        <w:t xml:space="preserve"> </w:t>
+      </w:r>
+      <w:r>
+        <w:tab/>
+      </w:r>
+    </w:p>
+    <w:p/>
+    <w:p>
+      <w:pPr>
+        <w:pStyle w:val="Ttulo2"/>
+        <w:rPr>
+          <w:b/>
+          <w:bCs/>
+          <w:sz w:val="28"/>
+          <w:szCs w:val="28"/>
+        </w:rPr>
+      </w:pPr>
+      <w:r>
+        <w:rPr>
+          <w:b/>
+          <w:bCs/>
+          <w:sz w:val="28"/>
+          <w:szCs w:val="28"/>
+        </w:rPr>
+        <w:t>Siguiente</w:t>
+      </w:r>
+      <w:r>
+        <w:rPr>
+          <w:b/>
+          <w:bCs/>
+          <w:sz w:val="28"/>
+          <w:szCs w:val="28"/>
+        </w:rPr>
+        <w:t xml:space="preserve"> </w:t>
+      </w:r>
+      <w:r>
+        <w:rPr>
+          <w:b/>
+          <w:bCs/>
+          <w:sz w:val="28"/>
+          <w:szCs w:val="28"/>
+        </w:rPr>
+        <w:t>turno</w:t>
+      </w:r>
+    </w:p>
+    <w:p>
+      <w:pPr>
+        <w:rPr>
+          <w:b/>
+          <w:bCs/>
+        </w:rPr>
+      </w:pPr>
+      <w:r>
+        <w:t xml:space="preserve">Le dice a </w:t>
+      </w:r>
+      <w:proofErr w:type="spellStart"/>
+      <w:r>
+        <w:t>prolog</w:t>
+      </w:r>
+      <w:proofErr w:type="spellEnd"/>
+      <w:r>
+        <w:t xml:space="preserve">, quien va después de quién. </w:t>
+      </w:r>
+      <w:proofErr w:type="spellStart"/>
+      <w:r>
+        <w:t>Basicamente</w:t>
+      </w:r>
+      <w:proofErr w:type="spellEnd"/>
+      <w:r>
+        <w:t xml:space="preserve"> es para los turnos, es decir, que empieza el </w:t>
+      </w:r>
+      <w:r>
+        <w:rPr>
+          <w:b/>
+          <w:bCs/>
+        </w:rPr>
+        <w:t>jugador1</w:t>
+      </w:r>
+      <w:r>
+        <w:t xml:space="preserve"> y que le sigue el </w:t>
+      </w:r>
+      <w:r>
+        <w:rPr>
+          <w:b/>
+          <w:bCs/>
+        </w:rPr>
+        <w:t>jugador2</w:t>
+      </w:r>
+    </w:p>
+    <w:p>
+      <w:pPr>
+        <w:rPr>
+          <w:b/>
+          <w:bCs/>
+        </w:rPr>
+      </w:pPr>
+    </w:p>
+    <w:p>
+      <w:pPr>
+        <w:pStyle w:val="Ttulo2"/>
+        <w:rPr>
+          <w:b/>
+          <w:bCs/>
+          <w:sz w:val="28"/>
+          <w:szCs w:val="28"/>
+        </w:rPr>
+      </w:pPr>
+      <w:r>
+        <w:rPr>
+          <w:b/>
+          <w:bCs/>
+          <w:sz w:val="28"/>
+          <w:szCs w:val="28"/>
+        </w:rPr>
+        <w:t>Buscar jugador</w:t>
+      </w:r>
+    </w:p>
+    <w:p>
+      <w:r>
+        <w:t xml:space="preserve">Nos saca todos los datos del jugador (propiedades, dinero, </w:t>
+      </w:r>
+      <w:proofErr w:type="spellStart"/>
+      <w:r>
+        <w:t>etc</w:t>
+      </w:r>
+      <w:proofErr w:type="spellEnd"/>
+      <w:r>
+        <w:t>) a partir de su nombre</w:t>
+      </w:r>
+      <w:r>
+        <w:t>, que viene definido en la lista de Jugadores</w:t>
+      </w:r>
+      <w:r>
+        <w:t xml:space="preserve">. La cosa es que </w:t>
+      </w:r>
+      <w:r>
+        <w:rPr>
+          <w:b/>
+          <w:bCs/>
+        </w:rPr>
+        <w:t>le pasamos</w:t>
+      </w:r>
+      <w:r>
+        <w:rPr>
+          <w:b/>
+          <w:bCs/>
+        </w:rPr>
+        <w:t xml:space="preserve"> la lista completa de </w:t>
+      </w:r>
+      <w:r>
+        <w:rPr>
+          <w:b/>
+          <w:bCs/>
+        </w:rPr>
+        <w:lastRenderedPageBreak/>
+        <w:t>jugadores</w:t>
+      </w:r>
+      <w:r>
+        <w:t xml:space="preserve">, y el nombre del jugador que queremos encontrar, y </w:t>
+      </w:r>
+      <w:r>
+        <w:rPr>
+          <w:b/>
+          <w:bCs/>
+        </w:rPr>
+        <w:t>nos devuelve la caja completa (todos los datos) de ese jugado</w:t>
+      </w:r>
+      <w:r>
         <w:t>r</w:t>
       </w:r>
-      <w:r>
-        <w:rPr>
-          <w:b/>
-          <w:bCs/>
-          <w:sz w:val="28"/>
-          <w:szCs w:val="28"/>
-        </w:rPr>
-        <w:t xml:space="preserve"> </w:t>
-      </w:r>
-      <w:r>
-        <w:rPr>
-          <w:b/>
-          <w:bCs/>
-          <w:sz w:val="28"/>
-          <w:szCs w:val="28"/>
-        </w:rPr>
-        <w:t>movimiento</w:t>
-      </w:r>
-    </w:p>
-    <w:p>
-      <w:r>
-        <w:t xml:space="preserve">Simplemente agrupa </w:t>
-      </w:r>
-      <w:r>
-        <w:rPr>
-          <w:b/>
-          <w:bCs/>
-          <w:color w:val="4472C4" w:themeColor="accent1"/>
-        </w:rPr>
-        <w:t>Tirar Dado</w:t>
-      </w:r>
-      <w:r>
-        <w:rPr>
-          <w:color w:val="4472C4" w:themeColor="accent1"/>
-        </w:rPr>
-        <w:t xml:space="preserve"> </w:t>
-      </w:r>
-      <w:r>
-        <w:t xml:space="preserve">y </w:t>
-      </w:r>
-      <w:r>
-        <w:rPr>
-          <w:b/>
-          <w:bCs/>
-          <w:color w:val="4472C4" w:themeColor="accent1"/>
-        </w:rPr>
-        <w:t>Mover Jugador</w:t>
-      </w:r>
-      <w:r>
-        <w:rPr>
-          <w:color w:val="4472C4" w:themeColor="accent1"/>
-        </w:rPr>
-        <w:t xml:space="preserve"> </w:t>
-      </w:r>
-      <w:r>
-        <w:rPr>
-          <w:b/>
-          <w:bCs/>
-        </w:rPr>
-        <w:t>en una sola acción</w:t>
-      </w:r>
-      <w:r>
-        <w:t>, ya que en realidad van de la mano (cuando tiras un dado después te mueves). Esto lo hacemos para una mayor limpieza del código y evitar así llamar a dos funciones cada vez que las necesitemos a lo largo de todo el programa.</w:t>
-      </w:r>
-    </w:p>
-    <w:p>
-      <w:r>
-        <w:t xml:space="preserve">Le pasamos el </w:t>
-      </w:r>
-      <w:r>
-        <w:rPr>
-          <w:b/>
-          <w:bCs/>
-        </w:rPr>
-        <w:t>jugador actual</w:t>
-      </w:r>
-      <w:r>
-        <w:t xml:space="preserve"> (</w:t>
-      </w:r>
-      <w:proofErr w:type="gramStart"/>
-      <w:r>
-        <w:rPr>
-          <w:b/>
-          <w:bCs/>
-        </w:rPr>
-        <w:t>jugador(</w:t>
-      </w:r>
-      <w:proofErr w:type="gramEnd"/>
-      <w:r>
-        <w:rPr>
-          <w:b/>
-          <w:bCs/>
-        </w:rPr>
-        <w:t xml:space="preserve">(Nombre, </w:t>
-      </w:r>
-      <w:proofErr w:type="spellStart"/>
-      <w:r>
-        <w:rPr>
-          <w:b/>
-          <w:bCs/>
-        </w:rPr>
-        <w:t>Pos</w:t>
-      </w:r>
-      <w:proofErr w:type="spellEnd"/>
-      <w:r>
-        <w:rPr>
-          <w:b/>
-          <w:bCs/>
-        </w:rPr>
-        <w:t>, Dinero, Props</w:t>
-      </w:r>
-      <w:proofErr w:type="gramStart"/>
-      <w:r>
-        <w:rPr>
-          <w:b/>
-          <w:bCs/>
-        </w:rPr>
-        <w:t>))</w:t>
-      </w:r>
-      <w:r>
-        <w:rPr>
-          <w:b/>
-          <w:bCs/>
-        </w:rPr>
-        <w:t xml:space="preserve"> </w:t>
-      </w:r>
-      <w:r>
-        <w:t xml:space="preserve"> y</w:t>
-      </w:r>
-      <w:proofErr w:type="gramEnd"/>
-      <w:r>
-        <w:t xml:space="preserve"> el </w:t>
-      </w:r>
-      <w:r>
-        <w:rPr>
-          <w:b/>
-          <w:bCs/>
-        </w:rPr>
-        <w:t>Numero de turno</w:t>
-      </w:r>
-      <w:r>
-        <w:t xml:space="preserve"> global. Llama a tirar dado y lo guarda en la variable </w:t>
-      </w:r>
-      <w:proofErr w:type="spellStart"/>
-      <w:r>
-        <w:rPr>
-          <w:b/>
-          <w:bCs/>
-        </w:rPr>
-        <w:t>DadoSacado</w:t>
-      </w:r>
-      <w:proofErr w:type="spellEnd"/>
-      <w:r>
-        <w:t xml:space="preserve">. Luego llama a </w:t>
-      </w:r>
-      <w:r>
-        <w:rPr>
-          <w:b/>
-          <w:bCs/>
-        </w:rPr>
-        <w:t>Mover Jugador</w:t>
-      </w:r>
-      <w:r>
-        <w:t xml:space="preserve"> y devuelve al jugador con su nueva posición y si hace falta su nuevo dinero </w:t>
-      </w:r>
-    </w:p>
-    <w:p>
-      <w:r>
-        <w:t xml:space="preserve">La función devuelve el jugador y el dado que ha sacado (que esto </w:t>
-      </w:r>
-      <w:proofErr w:type="spellStart"/>
-      <w:r>
-        <w:t>ultimo</w:t>
-      </w:r>
-      <w:proofErr w:type="spellEnd"/>
-      <w:r>
-        <w:t xml:space="preserve"> nos es útil para luego imprimir el numero que ha sacado el dado en </w:t>
-      </w:r>
-      <w:proofErr w:type="spellStart"/>
-      <w:r>
-        <w:rPr>
-          <w:b/>
-          <w:bCs/>
-          <w:color w:val="4472C4" w:themeColor="accent1"/>
-        </w:rPr>
-        <w:t>turno_limpio</w:t>
-      </w:r>
-      <w:proofErr w:type="spellEnd"/>
-      <w:r>
-        <w:t xml:space="preserve"> </w:t>
-      </w:r>
-      <w:r>
-        <w:tab/>
-      </w:r>
-    </w:p>
+    </w:p>
+    <w:p>
+      <w:r>
+        <w:t>Funciona de tal manera que mira la cabeza de la lista de jugadores (es decir, el primero) y si coincide con el nombre del jugador que estamos buscando, saca sus datos.</w:t>
+      </w:r>
+    </w:p>
+    <w:p>
+      <w:r>
+        <w:t>Si no, llama recursivamente</w:t>
+      </w:r>
+    </w:p>
+    <w:p>
+      <w:pPr>
+        <w:rPr>
+          <w:b/>
+          <w:bCs/>
+        </w:rPr>
+      </w:pPr>
+    </w:p>
+    <w:p/>
+    <w:p/>
     <w:p/>
     <w:p/>
     <w:sectPr>

</xml_diff>